<commit_message>
Updated motion and other docs
</commit_message>
<xml_diff>
--- a/Filings/1. SummonsAndComplaint/Court/Affidavit_of_Service_Corrected_Filing_Lu_Hu.docx
+++ b/Filings/1. SummonsAndComplaint/Court/Affidavit_of_Service_Corrected_Filing_Lu_Hu.docx
@@ -230,6 +230,59 @@
           </w:p>
         </w:tc>
       </w:tr>
+      <w:tr>
+        <w:tc>
+          <w:tcPr>
+            <w:tcW w:type="dxa" w:w="4680"/>
+            <w:tcBorders>
+              <w:top w:val="none"/>
+              <w:left w:val="none"/>
+              <w:bottom w:val="none"/>
+              <w:right w:val="none"/>
+            </w:tcBorders>
+          </w:tcPr>
+          <w:p>
+            <w:r>
+              <w:rPr>
+                <w:b w:val="false"/>
+                <w:bCs w:val="false"/>
+                <w:i w:val="false"/>
+                <w:iCs w:val="false"/>
+                <w:sz w:val="24"/>
+                <w:szCs w:val="24"/>
+              </w:rPr>
+              <w:t xml:space="preserve"/>
+            </w:r>
+          </w:p>
+        </w:tc>
+        <w:tc>
+          <w:tcPr>
+            <w:tcW w:type="dxa" w:w="4680"/>
+            <w:tcBorders>
+              <w:top w:val="none"/>
+              <w:left w:val="none"/>
+              <w:bottom w:val="none"/>
+              <w:right w:val="none"/>
+            </w:tcBorders>
+          </w:tcPr>
+          <w:p>
+            <w:pPr>
+              <w:jc w:val="right"/>
+            </w:pPr>
+            <w:r>
+              <w:rPr>
+                <w:b w:val="false"/>
+                <w:bCs w:val="false"/>
+                <w:i w:val="false"/>
+                <w:iCs w:val="false"/>
+                <w:sz w:val="24"/>
+                <w:szCs w:val="24"/>
+              </w:rPr>
+              <w:t xml:space="preserve">Judge: The Honorable Jamie L. Anderson</w:t>
+            </w:r>
+          </w:p>
+        </w:tc>
+      </w:tr>
     </w:tbl>
     <w:p>
       <w:pPr>
@@ -238,7 +291,7 @@
     </w:p>
     <w:p>
       <w:pPr>
-        <w:spacing w:after="200"/>
+        <w:spacing w:after="200" w:line="480" w:lineRule="auto"/>
       </w:pPr>
       <w:r>
         <w:rPr>
@@ -254,7 +307,7 @@
     </w:p>
     <w:p>
       <w:pPr>
-        <w:spacing w:after="200"/>
+        <w:spacing w:after="200" w:line="480" w:lineRule="auto"/>
         <w:ind w:left="720"/>
       </w:pPr>
       <w:r>
@@ -271,7 +324,7 @@
     </w:p>
     <w:p>
       <w:pPr>
-        <w:spacing w:after="200"/>
+        <w:spacing w:after="200" w:line="480" w:lineRule="auto"/>
       </w:pPr>
       <w:r>
         <w:rPr>
@@ -287,7 +340,7 @@
     </w:p>
     <w:p>
       <w:pPr>
-        <w:spacing w:after="200"/>
+        <w:spacing w:after="200" w:line="480" w:lineRule="auto"/>
       </w:pPr>
       <w:r>
         <w:rPr>
@@ -303,7 +356,7 @@
     </w:p>
     <w:p>
       <w:pPr>
-        <w:spacing w:after="200"/>
+        <w:spacing w:after="200" w:line="480" w:lineRule="auto"/>
         <w:ind w:left="720"/>
       </w:pPr>
       <w:r>
@@ -345,7 +398,7 @@
     </w:p>
     <w:p>
       <w:pPr>
-        <w:spacing w:after="200"/>
+        <w:spacing w:after="200" w:line="480" w:lineRule="auto"/>
       </w:pPr>
       <w:r>
         <w:rPr>
@@ -372,7 +425,7 @@
     </w:p>
     <w:p>
       <w:pPr>
-        <w:spacing w:after="200"/>
+        <w:spacing w:after="200" w:line="480" w:lineRule="auto"/>
       </w:pPr>
       <w:r>
         <w:rPr>
@@ -388,7 +441,7 @@
     </w:p>
     <w:p>
       <w:pPr>
-        <w:spacing w:after="200"/>
+        <w:spacing w:after="200" w:line="480" w:lineRule="auto"/>
       </w:pPr>
       <w:r>
         <w:rPr>
@@ -415,7 +468,7 @@
     </w:p>
     <w:p>
       <w:pPr>
-        <w:spacing w:after="200"/>
+        <w:spacing w:after="200" w:line="480" w:lineRule="auto"/>
       </w:pPr>
       <w:r>
         <w:rPr>
@@ -431,7 +484,7 @@
     </w:p>
     <w:p>
       <w:pPr>
-        <w:spacing w:after="200"/>
+        <w:spacing w:after="200" w:line="480" w:lineRule="auto"/>
       </w:pPr>
       <w:r>
         <w:rPr>
@@ -447,7 +500,7 @@
     </w:p>
     <w:p>
       <w:pPr>
-        <w:spacing w:after="200"/>
+        <w:spacing w:after="200" w:line="480" w:lineRule="auto"/>
       </w:pPr>
       <w:r>
         <w:rPr>
@@ -463,7 +516,7 @@
     </w:p>
     <w:p>
       <w:pPr>
-        <w:spacing w:after="200"/>
+        <w:spacing w:after="200" w:line="480" w:lineRule="auto"/>
       </w:pPr>
       <w:r>
         <w:rPr>
@@ -479,7 +532,7 @@
     </w:p>
     <w:p>
       <w:pPr>
-        <w:spacing w:after="60"/>
+        <w:spacing w:after="60" w:line="480" w:lineRule="auto"/>
         <w:ind w:left="720"/>
       </w:pPr>
       <w:r>
@@ -496,7 +549,7 @@
     </w:p>
     <w:p>
       <w:pPr>
-        <w:spacing w:after="200"/>
+        <w:spacing w:after="200" w:line="480" w:lineRule="auto"/>
         <w:ind w:left="720"/>
       </w:pPr>
       <w:r>
@@ -513,7 +566,7 @@
     </w:p>
     <w:p>
       <w:pPr>
-        <w:spacing w:after="200"/>
+        <w:spacing w:after="200" w:line="480" w:lineRule="auto"/>
         <w:ind w:left="720"/>
       </w:pPr>
       <w:r>
@@ -530,7 +583,7 @@
     </w:p>
     <w:p>
       <w:pPr>
-        <w:spacing w:after="200"/>
+        <w:spacing w:after="200" w:line="480" w:lineRule="auto"/>
       </w:pPr>
       <w:r>
         <w:rPr>
@@ -546,7 +599,7 @@
     </w:p>
     <w:p>
       <w:pPr>
-        <w:spacing w:after="60"/>
+        <w:spacing w:after="60" w:line="480" w:lineRule="auto"/>
         <w:ind w:left="720"/>
       </w:pPr>
       <w:r>
@@ -563,7 +616,7 @@
     </w:p>
     <w:p>
       <w:pPr>
-        <w:spacing w:after="200"/>
+        <w:spacing w:after="200" w:line="480" w:lineRule="auto"/>
         <w:ind w:left="720"/>
       </w:pPr>
       <w:r>
@@ -580,7 +633,7 @@
     </w:p>
     <w:p>
       <w:pPr>
-        <w:spacing w:after="200"/>
+        <w:spacing w:after="200" w:line="480" w:lineRule="auto"/>
       </w:pPr>
       <w:r>
         <w:rPr>
@@ -596,7 +649,7 @@
     </w:p>
     <w:p>
       <w:pPr>
-        <w:spacing w:after="60"/>
+        <w:spacing w:after="60" w:line="480" w:lineRule="auto"/>
         <w:ind w:left="720"/>
       </w:pPr>
       <w:r>
@@ -613,7 +666,7 @@
     </w:p>
     <w:p>
       <w:pPr>
-        <w:spacing w:after="60"/>
+        <w:spacing w:after="60" w:line="480" w:lineRule="auto"/>
         <w:ind w:left="720"/>
       </w:pPr>
       <w:r>
@@ -630,7 +683,7 @@
     </w:p>
     <w:p>
       <w:pPr>
-        <w:spacing w:after="200"/>
+        <w:spacing w:after="200" w:line="480" w:lineRule="auto"/>
         <w:ind w:left="720"/>
       </w:pPr>
       <w:r>
@@ -679,7 +732,7 @@
     </w:p>
     <w:p>
       <w:pPr>
-        <w:spacing w:after="0"/>
+        <w:spacing w:after="0" w:line="240" w:lineRule="auto"/>
       </w:pPr>
       <w:r>
         <w:rPr>
@@ -711,7 +764,7 @@
     </w:p>
     <w:p>
       <w:pPr>
-        <w:spacing w:after="200"/>
+        <w:spacing w:after="200" w:line="480" w:lineRule="auto"/>
       </w:pPr>
       <w:r>
         <w:rPr>
@@ -727,7 +780,7 @@
     </w:p>
     <w:p>
       <w:pPr>
-        <w:spacing w:after="200"/>
+        <w:spacing w:after="200" w:line="480" w:lineRule="auto"/>
       </w:pPr>
       <w:r>
         <w:rPr>
@@ -743,7 +796,7 @@
     </w:p>
     <w:p>
       <w:pPr>
-        <w:spacing w:after="200"/>
+        <w:spacing w:after="200" w:line="480" w:lineRule="auto"/>
       </w:pPr>
       <w:r>
         <w:rPr>
@@ -775,7 +828,7 @@
     </w:p>
     <w:p>
       <w:pPr>
-        <w:spacing w:after="0"/>
+        <w:spacing w:after="0" w:line="240" w:lineRule="auto"/>
       </w:pPr>
       <w:r>
         <w:rPr>
@@ -791,7 +844,7 @@
     </w:p>
     <w:p>
       <w:pPr>
-        <w:spacing w:after="0"/>
+        <w:spacing w:after="0" w:line="240" w:lineRule="auto"/>
       </w:pPr>
       <w:r>
         <w:rPr>

</xml_diff>